<commit_message>
application number added on template header
</commit_message>
<xml_diff>
--- a/backend/templates/nfsi-form.docx
+++ b/backend/templates/nfsi-form.docx
@@ -4,14 +4,188 @@
   <w:body>
     <w:p>
       <w:pPr>
-        <w:spacing w:after="0" w:line="240" w:lineRule="auto"/>
+        <w:spacing w:line="240" w:lineRule="auto"/>
+        <w:ind w:right="4"/>
+        <w:contextualSpacing/>
         <w:jc w:val="center"/>
         <w:rPr>
-          <w:rFonts w:ascii="Century Gothic" w:hAnsi="Century Gothic"/>
-          <w:sz w:val="24"/>
-          <w:szCs w:val="24"/>
-        </w:rPr>
-      </w:pPr>
+          <w:rFonts w:ascii="Arial" w:hAnsi="Arial" w:eastAsia="Calibri" w:cs="Arial"/>
+          <w:sz w:val="18"/>
+          <w:szCs w:val="18"/>
+        </w:rPr>
+      </w:pPr>
+      <w:bookmarkStart w:id="0" w:name="_GoBack"/>
+      <w:bookmarkEnd w:id="0"/>
+      <w:r>
+        <w:rPr>
+          <w:rFonts w:ascii="Arial" w:hAnsi="Arial" w:eastAsia="Arial" w:cs="Arial"/>
+          <w:b/>
+        </w:rPr>
+        <mc:AlternateContent>
+          <mc:Choice Requires="wps">
+            <w:drawing>
+              <wp:anchor distT="45720" distB="45720" distL="114300" distR="114300" simplePos="0" relativeHeight="251666432" behindDoc="1" locked="0" layoutInCell="1" allowOverlap="1">
+                <wp:simplePos x="0" y="0"/>
+                <wp:positionH relativeFrom="margin">
+                  <wp:posOffset>4839970</wp:posOffset>
+                </wp:positionH>
+                <wp:positionV relativeFrom="paragraph">
+                  <wp:posOffset>-1073785</wp:posOffset>
+                </wp:positionV>
+                <wp:extent cx="2202815" cy="262255"/>
+                <wp:effectExtent l="0" t="0" r="0" b="0"/>
+                <wp:wrapNone/>
+                <wp:docPr id="1" name="Text Box 2"/>
+                <wp:cNvGraphicFramePr/>
+                <a:graphic xmlns:a="http://schemas.openxmlformats.org/drawingml/2006/main">
+                  <a:graphicData uri="http://schemas.microsoft.com/office/word/2010/wordprocessingShape">
+                    <wps:wsp>
+                      <wps:cNvSpPr txBox="1">
+                        <a:spLocks noChangeArrowheads="1"/>
+                      </wps:cNvSpPr>
+                      <wps:spPr bwMode="auto">
+                        <a:xfrm>
+                          <a:off x="0" y="0"/>
+                          <a:ext cx="2202815" cy="262255"/>
+                        </a:xfrm>
+                        <a:prstGeom prst="rect">
+                          <a:avLst/>
+                        </a:prstGeom>
+                        <a:noFill/>
+                        <a:ln w="9525">
+                          <a:noFill/>
+                          <a:miter lim="800000"/>
+                        </a:ln>
+                      </wps:spPr>
+                      <wps:txbx>
+                        <w:txbxContent>
+                          <w:p>
+                            <w:pPr>
+                              <w:jc w:val="center"/>
+                              <w:rPr>
+                                <w:rFonts w:hint="default" w:ascii="Arial" w:hAnsi="Arial" w:cs="Arial"/>
+                                <w:b/>
+                                <w:bCs/>
+                                <w:sz w:val="14"/>
+                                <w:szCs w:val="14"/>
+                                <w:u w:val="none"/>
+                                <w:lang w:val="en-PH"/>
+                              </w:rPr>
+                            </w:pPr>
+                            <w:r>
+                              <w:rPr>
+                                <w:rFonts w:hint="default" w:ascii="Arial" w:hAnsi="Arial" w:cs="Arial"/>
+                                <w:b/>
+                                <w:bCs/>
+                                <w:sz w:val="14"/>
+                                <w:szCs w:val="14"/>
+                                <w:u w:val="none"/>
+                                <w:lang w:val="en-PH"/>
+                              </w:rPr>
+                              <w:t>{</w:t>
+                            </w:r>
+                            <w:r>
+                              <w:rPr>
+                                <w:rFonts w:hint="default" w:ascii="Arial" w:hAnsi="Arial" w:cs="Arial"/>
+                                <w:b/>
+                                <w:bCs/>
+                                <w:sz w:val="14"/>
+                                <w:szCs w:val="14"/>
+                                <w:u w:val="none"/>
+                                <w:lang w:val="en-US"/>
+                              </w:rPr>
+                              <w:t>APPLICATION_NO</w:t>
+                            </w:r>
+                            <w:r>
+                              <w:rPr>
+                                <w:rFonts w:hint="default" w:ascii="Arial" w:hAnsi="Arial" w:cs="Arial"/>
+                                <w:b/>
+                                <w:bCs/>
+                                <w:sz w:val="14"/>
+                                <w:szCs w:val="14"/>
+                                <w:u w:val="none"/>
+                                <w:lang w:val="en-PH"/>
+                              </w:rPr>
+                              <w:t>}</w:t>
+                            </w:r>
+                          </w:p>
+                        </w:txbxContent>
+                      </wps:txbx>
+                      <wps:bodyPr rot="0" vert="horz" wrap="square" lIns="91440" tIns="45720" rIns="91440" bIns="45720" anchor="t" anchorCtr="0">
+                        <a:noAutofit/>
+                      </wps:bodyPr>
+                    </wps:wsp>
+                  </a:graphicData>
+                </a:graphic>
+              </wp:anchor>
+            </w:drawing>
+          </mc:Choice>
+          <mc:Fallback>
+            <w:pict>
+              <v:shape id="Text Box 2" o:spid="_x0000_s1026" o:spt="202" type="#_x0000_t202" style="position:absolute;left:0pt;margin-left:381.1pt;margin-top:-84.55pt;height:20.65pt;width:173.45pt;mso-position-horizontal-relative:margin;z-index:-251650048;mso-width-relative:page;mso-height-relative:page;" filled="f" stroked="f" coordsize="21600,21600" o:gfxdata="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">
+                <v:fill on="f" focussize="0,0"/>
+                <v:stroke on="f" miterlimit="8" joinstyle="miter"/>
+                <v:imagedata o:title=""/>
+                <o:lock v:ext="edit" aspectratio="f"/>
+                <v:textbox>
+                  <w:txbxContent>
+                    <w:p>
+                      <w:pPr>
+                        <w:jc w:val="center"/>
+                        <w:rPr>
+                          <w:rFonts w:hint="default" w:ascii="Arial" w:hAnsi="Arial" w:cs="Arial"/>
+                          <w:b/>
+                          <w:bCs/>
+                          <w:sz w:val="14"/>
+                          <w:szCs w:val="14"/>
+                          <w:u w:val="none"/>
+                          <w:lang w:val="en-PH"/>
+                        </w:rPr>
+                      </w:pPr>
+                      <w:r>
+                        <w:rPr>
+                          <w:rFonts w:hint="default" w:ascii="Arial" w:hAnsi="Arial" w:cs="Arial"/>
+                          <w:b/>
+                          <w:bCs/>
+                          <w:sz w:val="14"/>
+                          <w:szCs w:val="14"/>
+                          <w:u w:val="none"/>
+                          <w:lang w:val="en-PH"/>
+                        </w:rPr>
+                        <w:t>{</w:t>
+                      </w:r>
+                      <w:r>
+                        <w:rPr>
+                          <w:rFonts w:hint="default" w:ascii="Arial" w:hAnsi="Arial" w:cs="Arial"/>
+                          <w:b/>
+                          <w:bCs/>
+                          <w:sz w:val="14"/>
+                          <w:szCs w:val="14"/>
+                          <w:u w:val="none"/>
+                          <w:lang w:val="en-US"/>
+                        </w:rPr>
+                        <w:t>APPLICATION_NO</w:t>
+                      </w:r>
+                      <w:r>
+                        <w:rPr>
+                          <w:rFonts w:hint="default" w:ascii="Arial" w:hAnsi="Arial" w:cs="Arial"/>
+                          <w:b/>
+                          <w:bCs/>
+                          <w:sz w:val="14"/>
+                          <w:szCs w:val="14"/>
+                          <w:u w:val="none"/>
+                          <w:lang w:val="en-PH"/>
+                        </w:rPr>
+                        <w:t>}</w:t>
+                      </w:r>
+                    </w:p>
+                  </w:txbxContent>
+                </v:textbox>
+              </v:shape>
+            </w:pict>
+          </mc:Fallback>
+        </mc:AlternateContent>
+      </w:r>
     </w:p>
     <w:p>
       <w:pPr>
@@ -409,7 +583,7 @@
           </mc:Choice>
           <mc:Fallback>
             <w:pict>
-              <v:line id="Straight Connector 22" o:spid="_x0000_s1026" o:spt="20" style="position:absolute;left:0pt;flip:y;margin-left:341.5pt;margin-top:13.3pt;height:1.05pt;width:138.15pt;z-index:251664384;mso-width-relative:page;mso-height-relative:page;" filled="f" stroked="t" coordsize="21600,21600" o:gfxdata="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">
+              <v:line id="Straight Connector 22" o:spid="_x0000_s1026" o:spt="20" style="position:absolute;left:0pt;flip:y;margin-left:341.5pt;margin-top:13.3pt;height:1.05pt;width:138.15pt;z-index:251664384;mso-width-relative:page;mso-height-relative:page;" filled="f" stroked="t" coordsize="21600,21600" o:gfxdata="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">
                 <v:fill on="f" focussize="0,0"/>
                 <v:stroke color="#000000 [3200]" joinstyle="round"/>
                 <v:imagedata o:title=""/>
@@ -660,7 +834,6 @@
           <w:lang w:val="en-US"/>
         </w:rPr>
         <w:tab/>
-        <w:t/>
       </w:r>
       <w:r>
         <w:rPr>
@@ -670,7 +843,6 @@
           <w:lang w:val="en-US"/>
         </w:rPr>
         <w:tab/>
-        <w:t/>
       </w:r>
       <w:r>
         <w:rPr>
@@ -680,7 +852,6 @@
           <w:lang w:val="en-US"/>
         </w:rPr>
         <w:tab/>
-        <w:t/>
       </w:r>
       <w:r>
         <w:rPr>
@@ -708,7 +879,6 @@
           <w:lang w:val="en-US"/>
         </w:rPr>
         <w:tab/>
-        <w:t/>
       </w:r>
       <w:r>
         <w:rPr>
@@ -718,7 +888,6 @@
           <w:lang w:val="en-US"/>
         </w:rPr>
         <w:tab/>
-        <w:t/>
       </w:r>
       <w:r>
         <w:rPr>
@@ -728,7 +897,6 @@
           <w:lang w:val="en-US"/>
         </w:rPr>
         <w:tab/>
-        <w:t/>
       </w:r>
       <w:r>
         <w:rPr>
@@ -738,7 +906,6 @@
           <w:lang w:val="en-US"/>
         </w:rPr>
         <w:tab/>
-        <w:t/>
       </w:r>
       <w:r>
         <w:rPr>
@@ -748,7 +915,6 @@
           <w:lang w:val="en-US"/>
         </w:rPr>
         <w:tab/>
-        <w:t/>
       </w:r>
       <w:r>
         <w:rPr>
@@ -758,7 +924,6 @@
           <w:lang w:val="en-US"/>
         </w:rPr>
         <w:tab/>
-        <w:t/>
       </w:r>
       <w:r>
         <w:rPr>
@@ -768,7 +933,6 @@
           <w:lang w:val="en-US"/>
         </w:rPr>
         <w:tab/>
-        <w:t/>
       </w:r>
       <w:r>
         <w:rPr>
@@ -778,7 +942,6 @@
           <w:lang w:val="en-US"/>
         </w:rPr>
         <w:tab/>
-        <w:t/>
       </w:r>
       <w:r>
         <w:rPr>
@@ -788,7 +951,6 @@
           <w:lang w:val="en-US"/>
         </w:rPr>
         <w:tab/>
-        <w:t/>
       </w:r>
       <w:r>
         <w:rPr>
@@ -798,7 +960,6 @@
           <w:lang w:val="en-US"/>
         </w:rPr>
         <w:tab/>
-        <w:t/>
       </w:r>
       <w:r>
         <w:rPr>
@@ -1145,8 +1306,6 @@
         </w:rPr>
         <w:fldChar w:fldCharType="end"/>
       </w:r>
-      <w:bookmarkStart w:id="0" w:name="_GoBack"/>
-      <w:bookmarkEnd w:id="0"/>
     </w:p>
     <w:p>
       <w:pPr>

</xml_diff>

<commit_message>
nfsi form (r10) fix
</commit_message>
<xml_diff>
--- a/backend/templates/nfsi-form.docx
+++ b/backend/templates/nfsi-form.docx
@@ -586,7 +586,7 @@
           <w:u w:val="single"/>
           <w:lang w:val="en-US"/>
         </w:rPr>
-        <w:t>R-10 NFSI {</w:t>
+        <w:t>R10 NFSI {</w:t>
       </w:r>
       <w:r>
         <w:rPr>
@@ -915,8 +915,6 @@
         </w:rPr>
         <w:tab/>
       </w:r>
-      <w:bookmarkStart w:id="0" w:name="_GoBack"/>
-      <w:bookmarkEnd w:id="0"/>
     </w:p>
     <w:p>
       <w:pPr>
@@ -1118,6 +1116,8 @@
         </w:rPr>
         <w:fldChar w:fldCharType="end"/>
       </w:r>
+      <w:bookmarkStart w:id="0" w:name="_GoBack"/>
+      <w:bookmarkEnd w:id="0"/>
     </w:p>
     <w:p>
       <w:pPr>

</xml_diff>